<commit_message>
Added plot of cumulative Groups found over time when plotting localizations over time
</commit_message>
<xml_diff>
--- a/QuantiTrack Changelog.docx
+++ b/QuantiTrack Changelog.docx
@@ -1,10 +1,32 @@
 
 <file path=word/document.xml><?xml version="1.0" encoding="utf-8"?>
-<w:document xmlns:wpc="http://schemas.microsoft.com/office/word/2010/wordprocessingCanvas" xmlns:cx="http://schemas.microsoft.com/office/drawing/2014/chartex" xmlns:cx1="http://schemas.microsoft.com/office/drawing/2015/9/8/chartex" xmlns:cx2="http://schemas.microsoft.com/office/drawing/2015/10/21/chartex" xmlns:cx3="http://schemas.microsoft.com/office/drawing/2016/5/9/chartex" xmlns:cx4="http://schemas.microsoft.com/office/drawing/2016/5/10/chartex" xmlns:cx5="http://schemas.microsoft.com/office/drawing/2016/5/11/chartex" xmlns:cx6="http://schemas.microsoft.com/office/drawing/2016/5/12/chartex" xmlns:cx7="http://schemas.microsoft.com/office/drawing/2016/5/13/chartex" xmlns:cx8="http://schemas.microsoft.com/office/drawing/2016/5/14/chartex" xmlns:mc="http://schemas.openxmlformats.org/markup-compatibility/2006" xmlns:aink="http://schemas.microsoft.com/office/drawing/2016/ink" xmlns:am3d="http://schemas.microsoft.com/office/drawing/2017/model3d" xmlns:o="urn:schemas-microsoft-com:office:office" xmlns:oel="http://schemas.microsoft.com/office/2019/extlst" xmlns:r="http://schemas.openxmlformats.org/officeDocument/2006/relationships" xmlns:m="http://schemas.openxmlformats.org/officeDocument/2006/math" xmlns:v="urn:schemas-microsoft-com:vml" xmlns:wp14="http://schemas.microsoft.com/office/word/2010/wordprocessingDrawing" xmlns:wp="http://schemas.openxmlformats.org/drawingml/2006/wordprocessingDrawing" xmlns:w10="urn:schemas-microsoft-com:office:word" xmlns:w="http://schemas.openxmlformats.org/wordprocessingml/2006/main" xmlns:w14="http://schemas.microsoft.com/office/word/2010/wordml" xmlns:w15="http://schemas.microsoft.com/office/word/2012/wordml" xmlns:w16cei="http://schemas.microsoft.com/office/word/2026/wordml/cei" xmlns:w16cex="http://schemas.microsoft.com/office/word/2018/wordml/cex" xmlns:w16cid="http://schemas.microsoft.com/office/word/2016/wordml/cid" xmlns:w16="http://schemas.microsoft.com/office/word/2018/wordml" xmlns:w16du="http://schemas.microsoft.com/office/word/2023/wordml/word16du" xmlns:w16sdtdh="http://schemas.microsoft.com/office/word/2020/wordml/sdtdatahash" xmlns:w16sdtfl="http://schemas.microsoft.com/office/word/2024/wordml/sdtformatlock" xmlns:w16se="http://schemas.microsoft.com/office/word/2015/wordml/symex" xmlns:wpg="http://schemas.microsoft.com/office/word/2010/wordprocessingGroup" xmlns:wpi="http://schemas.microsoft.com/office/word/2010/wordprocessingInk" xmlns:wne="http://schemas.microsoft.com/office/word/2006/wordml" xmlns:wps="http://schemas.microsoft.com/office/word/2010/wordprocessingShape" mc:Ignorable="w14 w15 w16se w16cid w16 w16cex w16sdtdh w16sdtfl w16du wp14">
+<w:document xmlns:wpc="http://schemas.microsoft.com/office/word/2010/wordprocessingCanvas" xmlns:cx="http://schemas.microsoft.com/office/drawing/2014/chartex" xmlns:cx1="http://schemas.microsoft.com/office/drawing/2015/9/8/chartex" xmlns:cx2="http://schemas.microsoft.com/office/drawing/2015/10/21/chartex" xmlns:cx3="http://schemas.microsoft.com/office/drawing/2016/5/9/chartex" xmlns:cx4="http://schemas.microsoft.com/office/drawing/2016/5/10/chartex" xmlns:cx5="http://schemas.microsoft.com/office/drawing/2016/5/11/chartex" xmlns:cx6="http://schemas.microsoft.com/office/drawing/2016/5/12/chartex" xmlns:cx7="http://schemas.microsoft.com/office/drawing/2016/5/13/chartex" xmlns:cx8="http://schemas.microsoft.com/office/drawing/2016/5/14/chartex" xmlns:mc="http://schemas.openxmlformats.org/markup-compatibility/2006" xmlns:aink="http://schemas.microsoft.com/office/drawing/2016/ink" xmlns:am3d="http://schemas.microsoft.com/office/drawing/2017/model3d" xmlns:o="urn:schemas-microsoft-com:office:office" xmlns:oel="http://schemas.microsoft.com/office/2019/extlst" xmlns:r="http://schemas.openxmlformats.org/officeDocument/2006/relationships" xmlns:m="http://schemas.openxmlformats.org/officeDocument/2006/math" xmlns:v="urn:schemas-microsoft-com:vml" xmlns:wp14="http://schemas.microsoft.com/office/word/2010/wordprocessingDrawing" xmlns:wp="http://schemas.openxmlformats.org/drawingml/2006/wordprocessingDrawing" xmlns:w10="urn:schemas-microsoft-com:office:word" xmlns:w="http://schemas.openxmlformats.org/wordprocessingml/2006/main" xmlns:w14="http://schemas.microsoft.com/office/word/2010/wordml" xmlns:w15="http://schemas.microsoft.com/office/word/2012/wordml" xmlns:w16cex="http://schemas.microsoft.com/office/word/2018/wordml/cex" xmlns:w16cid="http://schemas.microsoft.com/office/word/2016/wordml/cid" xmlns:w16="http://schemas.microsoft.com/office/word/2018/wordml" xmlns:w16du="http://schemas.microsoft.com/office/word/2023/wordml/word16du" xmlns:w16sdtdh="http://schemas.microsoft.com/office/word/2020/wordml/sdtdatahash" xmlns:w16sdtfl="http://schemas.microsoft.com/office/word/2024/wordml/sdtformatlock" xmlns:w16se="http://schemas.microsoft.com/office/word/2015/wordml/symex" xmlns:wpg="http://schemas.microsoft.com/office/word/2010/wordprocessingGroup" xmlns:wpi="http://schemas.microsoft.com/office/word/2010/wordprocessingInk" xmlns:wne="http://schemas.microsoft.com/office/word/2006/wordml" xmlns:wps="http://schemas.microsoft.com/office/word/2010/wordprocessingShape" mc:Ignorable="w14 w15 w16se w16cid w16 w16cex w16sdtdh w16sdtfl w16du wp14">
   <w:body>
     <w:p>
-      <w:r>
-        <w:t>QuantiTrack Changelog</w:t>
+      <w:proofErr w:type="spellStart"/>
+      <w:r>
+        <w:t>QuantiTrack</w:t>
+      </w:r>
+      <w:proofErr w:type="spellEnd"/>
+      <w:r>
+        <w:t xml:space="preserve"> Changelog</w:t>
+      </w:r>
+    </w:p>
+    <w:p>
+      <w:r>
+        <w:t>2026.10.27</w:t>
+      </w:r>
+    </w:p>
+    <w:p>
+      <w:pPr>
+        <w:pStyle w:val="ListParagraph"/>
+        <w:numPr>
+          <w:ilvl w:val="0"/>
+          <w:numId w:val="10"/>
+        </w:numPr>
+      </w:pPr>
+      <w:r>
+        <w:t>Added a threshold scan that plots the KS test statistic over a range of detection thresholds. Available in Tools-&gt;Scan Detection Threshold</w:t>
       </w:r>
     </w:p>
     <w:p>
@@ -21,7 +43,15 @@
         </w:numPr>
       </w:pPr>
       <w:r>
-        <w:t>Fixed bug in SpotOn analysis that caused mis-labeled parameters when using a 3-state model</w:t>
+        <w:t xml:space="preserve">Fixed bug in </w:t>
+      </w:r>
+      <w:proofErr w:type="spellStart"/>
+      <w:r>
+        <w:t>SpotOn</w:t>
+      </w:r>
+      <w:proofErr w:type="spellEnd"/>
+      <w:r>
+        <w:t xml:space="preserve"> analysis that caused mis-labeled parameters when using a 3-state model</w:t>
       </w:r>
     </w:p>
     <w:p>
@@ -38,7 +68,15 @@
         </w:numPr>
       </w:pPr>
       <w:r>
-        <w:t>Changed 1-frame jump distance histogram in PreProcess Window to nm (from pixels) and added a line showing the max Jump value.</w:t>
+        <w:t xml:space="preserve">Changed 1-frame jump distance histogram in </w:t>
+      </w:r>
+      <w:proofErr w:type="spellStart"/>
+      <w:r>
+        <w:t>PreProcess</w:t>
+      </w:r>
+      <w:proofErr w:type="spellEnd"/>
+      <w:r>
+        <w:t xml:space="preserve"> Window to nm (from pixels) and added a line showing the max Jump value.</w:t>
       </w:r>
     </w:p>
     <w:p>
@@ -50,7 +88,15 @@
         </w:numPr>
       </w:pPr>
       <w:r>
-        <w:t>Added 2-sample KS test to compare Particle Intensities to the local background in PreProcess Window</w:t>
+        <w:t xml:space="preserve">Added 2-sample KS test to compare Particle Intensities to the local background in </w:t>
+      </w:r>
+      <w:proofErr w:type="spellStart"/>
+      <w:r>
+        <w:t>PreProcess</w:t>
+      </w:r>
+      <w:proofErr w:type="spellEnd"/>
+      <w:r>
+        <w:t xml:space="preserve"> Window</w:t>
       </w:r>
     </w:p>
     <w:p>
@@ -62,7 +108,23 @@
         </w:numPr>
       </w:pPr>
       <w:r>
-        <w:t>Removed field called ‘Peaks’ from the Results structure. This was a remnant of the past where the Particles were called peaks. The use of peaks was stopped, but some references to it remained and ‘peaks’ is also a built-in matlab function so this resulted in the generation of a nonsense variable.</w:t>
+        <w:t xml:space="preserve">Removed field called ‘Peaks’ from the Results structure. This was a remnant of the past where the Particles were called peaks. The use of peaks was stopped, but some references to it remained and ‘peaks’ is also a built-in </w:t>
+      </w:r>
+      <w:proofErr w:type="spellStart"/>
+      <w:r>
+        <w:t>matlab</w:t>
+      </w:r>
+      <w:proofErr w:type="spellEnd"/>
+      <w:r>
+        <w:t xml:space="preserve"> </w:t>
+      </w:r>
+      <w:proofErr w:type="gramStart"/>
+      <w:r>
+        <w:t>function</w:t>
+      </w:r>
+      <w:proofErr w:type="gramEnd"/>
+      <w:r>
+        <w:t xml:space="preserve"> so this resulted in the generation of a nonsense variable.</w:t>
       </w:r>
     </w:p>
     <w:p>
@@ -77,7 +139,15 @@
         <w:t>Fix</w:t>
       </w:r>
       <w:r>
-        <w:t>ed a bug where pEM_postProcess would crash if a single state was optimal.</w:t>
+        <w:t xml:space="preserve">ed a bug where </w:t>
+      </w:r>
+      <w:proofErr w:type="spellStart"/>
+      <w:r>
+        <w:t>pEM_postProcess</w:t>
+      </w:r>
+      <w:proofErr w:type="spellEnd"/>
+      <w:r>
+        <w:t xml:space="preserve"> would crash if a single state was optimal.</w:t>
       </w:r>
     </w:p>
     <w:p>
@@ -89,7 +159,23 @@
         </w:numPr>
       </w:pPr>
       <w:r>
-        <w:t>Fixed a bug in pEM where skipped frames (with coordinates of NaNs) would cause issues with the analysis.</w:t>
+        <w:t xml:space="preserve">Fixed a bug in </w:t>
+      </w:r>
+      <w:proofErr w:type="spellStart"/>
+      <w:r>
+        <w:t>pEM</w:t>
+      </w:r>
+      <w:proofErr w:type="spellEnd"/>
+      <w:r>
+        <w:t xml:space="preserve"> where skipped frames (with coordinates of </w:t>
+      </w:r>
+      <w:proofErr w:type="spellStart"/>
+      <w:r>
+        <w:t>NaNs</w:t>
+      </w:r>
+      <w:proofErr w:type="spellEnd"/>
+      <w:r>
+        <w:t>) would cause issues with the analysis.</w:t>
       </w:r>
     </w:p>
     <w:p>
@@ -100,8 +186,29 @@
           <w:numId w:val="8"/>
         </w:numPr>
       </w:pPr>
-      <w:r>
-        <w:t>Fixed  a bug occurring when rendering heatmaps in pEM_postProcess if the the optimal number of states doesn’t include all possible states.</w:t>
+      <w:proofErr w:type="gramStart"/>
+      <w:r>
+        <w:t>Fixed  a</w:t>
+      </w:r>
+      <w:proofErr w:type="gramEnd"/>
+      <w:r>
+        <w:t xml:space="preserve"> bug occurring when rendering heatmaps in </w:t>
+      </w:r>
+      <w:proofErr w:type="spellStart"/>
+      <w:r>
+        <w:t>pEM_postProcess</w:t>
+      </w:r>
+      <w:proofErr w:type="spellEnd"/>
+      <w:r>
+        <w:t xml:space="preserve"> if the </w:t>
+      </w:r>
+      <w:proofErr w:type="spellStart"/>
+      <w:r>
+        <w:t>the</w:t>
+      </w:r>
+      <w:proofErr w:type="spellEnd"/>
+      <w:r>
+        <w:t xml:space="preserve"> optimal number of states doesn’t include all possible states.</w:t>
       </w:r>
     </w:p>
     <w:p>
@@ -203,7 +310,16 @@
         </w:numPr>
       </w:pPr>
       <w:r>
-        <w:t>Removed NaNs from anisotropy calculation as the plotting was showing values and I don’t understand where it got them from</w:t>
+        <w:lastRenderedPageBreak/>
+        <w:t xml:space="preserve">Removed </w:t>
+      </w:r>
+      <w:proofErr w:type="spellStart"/>
+      <w:r>
+        <w:t>NaNs</w:t>
+      </w:r>
+      <w:proofErr w:type="spellEnd"/>
+      <w:r>
+        <w:t xml:space="preserve"> from anisotropy calculation as the plotting was showing values and I don’t understand where it got them from</w:t>
       </w:r>
     </w:p>
     <w:p>
@@ -215,7 +331,6 @@
         </w:numPr>
       </w:pPr>
       <w:r>
-        <w:lastRenderedPageBreak/>
         <w:t>Added to the manual a description of the new parameter to remove small steps from the angle analysis.</w:t>
       </w:r>
     </w:p>
@@ -236,8 +351,21 @@
         </w:numPr>
       </w:pPr>
       <w:r>
-        <w:t>Fixed bug in saving copy of trackfile in R2025b. Apparently in this version of MATLAB, the file extension isn’t automatically appended to the file name in uiputfile</w:t>
-      </w:r>
+        <w:t xml:space="preserve">Fixed bug in saving copy of </w:t>
+      </w:r>
+      <w:proofErr w:type="spellStart"/>
+      <w:r>
+        <w:t>trackfile</w:t>
+      </w:r>
+      <w:proofErr w:type="spellEnd"/>
+      <w:r>
+        <w:t xml:space="preserve"> in R2025b. Apparently in this version of MATLAB, the file extension isn’t automatically appended to the file name in </w:t>
+      </w:r>
+      <w:proofErr w:type="spellStart"/>
+      <w:r>
+        <w:t>uiputfile</w:t>
+      </w:r>
+      <w:proofErr w:type="spellEnd"/>
     </w:p>
     <w:p>
       <w:pPr>
@@ -248,7 +376,15 @@
         </w:numPr>
       </w:pPr>
       <w:r>
-        <w:t>Added option to remove from the angle analysis any angle that consists of steps less than the localization precision.</w:t>
+        <w:t xml:space="preserve">Added option to remove from the angle </w:t>
+      </w:r>
+      <w:proofErr w:type="gramStart"/>
+      <w:r>
+        <w:t>analysis</w:t>
+      </w:r>
+      <w:proofErr w:type="gramEnd"/>
+      <w:r>
+        <w:t xml:space="preserve"> any angle that consists of steps less than the localization precision.</w:t>
       </w:r>
     </w:p>
     <w:p>
@@ -297,7 +433,15 @@
         </w:numPr>
       </w:pPr>
       <w:r>
-        <w:t>Added gaussian fitting to the bead selection gui for image aligning so that the transformation matrix isn’t so dependent on where you click</w:t>
+        <w:t xml:space="preserve">Added gaussian fitting to the bead selection </w:t>
+      </w:r>
+      <w:proofErr w:type="spellStart"/>
+      <w:r>
+        <w:t>gui</w:t>
+      </w:r>
+      <w:proofErr w:type="spellEnd"/>
+      <w:r>
+        <w:t xml:space="preserve"> for image aligning so that the transformation matrix isn’t so dependent on where you click</w:t>
       </w:r>
     </w:p>
     <w:p>
@@ -309,7 +453,23 @@
         </w:numPr>
       </w:pPr>
       <w:r>
-        <w:t>Added drop-down in ROI Tool allowing user to choose which channel to track if multiple tiff files are present within the folder. Allows the user to select ROI in one channel and track in another</w:t>
+        <w:t xml:space="preserve">Added drop-down in ROI Tool </w:t>
+      </w:r>
+      <w:proofErr w:type="gramStart"/>
+      <w:r>
+        <w:t>allowing</w:t>
+      </w:r>
+      <w:proofErr w:type="gramEnd"/>
+      <w:r>
+        <w:t xml:space="preserve"> </w:t>
+      </w:r>
+      <w:proofErr w:type="gramStart"/>
+      <w:r>
+        <w:t>user</w:t>
+      </w:r>
+      <w:proofErr w:type="gramEnd"/>
+      <w:r>
+        <w:t xml:space="preserve"> to choose which channel to track if multiple tiff files are present within the folder. Allows the user to select ROI in one channel and track in another</w:t>
       </w:r>
     </w:p>
     <w:p>
@@ -326,7 +486,15 @@
         </w:numPr>
       </w:pPr>
       <w:r>
-        <w:t>Added functionality to import ROIs from MetaMorph and ImageJ inside of the ROI tool</w:t>
+        <w:t xml:space="preserve">Added functionality to import ROIs from </w:t>
+      </w:r>
+      <w:proofErr w:type="spellStart"/>
+      <w:r>
+        <w:t>MetaMorph</w:t>
+      </w:r>
+      <w:proofErr w:type="spellEnd"/>
+      <w:r>
+        <w:t xml:space="preserve"> and ImageJ inside of the ROI tool</w:t>
       </w:r>
     </w:p>
     <w:p>
@@ -338,8 +506,13 @@
         </w:numPr>
       </w:pPr>
       <w:r>
-        <w:t>Added functionality to ROI tool for automated ROI detection from a reference images</w:t>
-      </w:r>
+        <w:t xml:space="preserve">Added functionality to ROI tool for automated ROI detection from a reference </w:t>
+      </w:r>
+      <w:proofErr w:type="gramStart"/>
+      <w:r>
+        <w:t>images</w:t>
+      </w:r>
+      <w:proofErr w:type="gramEnd"/>
     </w:p>
     <w:p>
       <w:pPr>
@@ -386,7 +559,15 @@
         </w:numPr>
       </w:pPr>
       <w:r>
-        <w:t>Fixed Split and align tool to work in cases where uManager movie was acquired while skipping frames in some channels</w:t>
+        <w:t xml:space="preserve">Fixed Split and align tool to work in cases where </w:t>
+      </w:r>
+      <w:proofErr w:type="spellStart"/>
+      <w:r>
+        <w:t>uManager</w:t>
+      </w:r>
+      <w:proofErr w:type="spellEnd"/>
+      <w:r>
+        <w:t xml:space="preserve"> movie was acquired while skipping frames in some channels</w:t>
       </w:r>
     </w:p>
     <w:p>
@@ -405,7 +586,7 @@
 </file>
 
 <file path=word/numbering.xml><?xml version="1.0" encoding="utf-8"?>
-<w:numbering xmlns:wpc="http://schemas.microsoft.com/office/word/2010/wordprocessingCanvas" xmlns:cx="http://schemas.microsoft.com/office/drawing/2014/chartex" xmlns:cx1="http://schemas.microsoft.com/office/drawing/2015/9/8/chartex" xmlns:cx2="http://schemas.microsoft.com/office/drawing/2015/10/21/chartex" xmlns:cx3="http://schemas.microsoft.com/office/drawing/2016/5/9/chartex" xmlns:cx4="http://schemas.microsoft.com/office/drawing/2016/5/10/chartex" xmlns:cx5="http://schemas.microsoft.com/office/drawing/2016/5/11/chartex" xmlns:cx6="http://schemas.microsoft.com/office/drawing/2016/5/12/chartex" xmlns:cx7="http://schemas.microsoft.com/office/drawing/2016/5/13/chartex" xmlns:cx8="http://schemas.microsoft.com/office/drawing/2016/5/14/chartex" xmlns:mc="http://schemas.openxmlformats.org/markup-compatibility/2006" xmlns:aink="http://schemas.microsoft.com/office/drawing/2016/ink" xmlns:am3d="http://schemas.microsoft.com/office/drawing/2017/model3d" xmlns:o="urn:schemas-microsoft-com:office:office" xmlns:oel="http://schemas.microsoft.com/office/2019/extlst" xmlns:r="http://schemas.openxmlformats.org/officeDocument/2006/relationships" xmlns:m="http://schemas.openxmlformats.org/officeDocument/2006/math" xmlns:v="urn:schemas-microsoft-com:vml" xmlns:wp14="http://schemas.microsoft.com/office/word/2010/wordprocessingDrawing" xmlns:wp="http://schemas.openxmlformats.org/drawingml/2006/wordprocessingDrawing" xmlns:w10="urn:schemas-microsoft-com:office:word" xmlns:w="http://schemas.openxmlformats.org/wordprocessingml/2006/main" xmlns:w14="http://schemas.microsoft.com/office/word/2010/wordml" xmlns:w15="http://schemas.microsoft.com/office/word/2012/wordml" xmlns:w16cei="http://schemas.microsoft.com/office/word/2026/wordml/cei" xmlns:w16cex="http://schemas.microsoft.com/office/word/2018/wordml/cex" xmlns:w16cid="http://schemas.microsoft.com/office/word/2016/wordml/cid" xmlns:w16="http://schemas.microsoft.com/office/word/2018/wordml" xmlns:w16du="http://schemas.microsoft.com/office/word/2023/wordml/word16du" xmlns:w16sdtdh="http://schemas.microsoft.com/office/word/2020/wordml/sdtdatahash" xmlns:w16sdtfl="http://schemas.microsoft.com/office/word/2024/wordml/sdtformatlock" xmlns:w16se="http://schemas.microsoft.com/office/word/2015/wordml/symex" xmlns:wpg="http://schemas.microsoft.com/office/word/2010/wordprocessingGroup" xmlns:wpi="http://schemas.microsoft.com/office/word/2010/wordprocessingInk" xmlns:wne="http://schemas.microsoft.com/office/word/2006/wordml" xmlns:wps="http://schemas.microsoft.com/office/word/2010/wordprocessingShape" mc:Ignorable="w14 w15 w16se w16cid w16 w16cex w16sdtdh w16sdtfl w16du wp14">
+<w:numbering xmlns:wpc="http://schemas.microsoft.com/office/word/2010/wordprocessingCanvas" xmlns:cx="http://schemas.microsoft.com/office/drawing/2014/chartex" xmlns:cx1="http://schemas.microsoft.com/office/drawing/2015/9/8/chartex" xmlns:cx2="http://schemas.microsoft.com/office/drawing/2015/10/21/chartex" xmlns:cx3="http://schemas.microsoft.com/office/drawing/2016/5/9/chartex" xmlns:cx4="http://schemas.microsoft.com/office/drawing/2016/5/10/chartex" xmlns:cx5="http://schemas.microsoft.com/office/drawing/2016/5/11/chartex" xmlns:cx6="http://schemas.microsoft.com/office/drawing/2016/5/12/chartex" xmlns:cx7="http://schemas.microsoft.com/office/drawing/2016/5/13/chartex" xmlns:cx8="http://schemas.microsoft.com/office/drawing/2016/5/14/chartex" xmlns:mc="http://schemas.openxmlformats.org/markup-compatibility/2006" xmlns:aink="http://schemas.microsoft.com/office/drawing/2016/ink" xmlns:am3d="http://schemas.microsoft.com/office/drawing/2017/model3d" xmlns:o="urn:schemas-microsoft-com:office:office" xmlns:oel="http://schemas.microsoft.com/office/2019/extlst" xmlns:r="http://schemas.openxmlformats.org/officeDocument/2006/relationships" xmlns:m="http://schemas.openxmlformats.org/officeDocument/2006/math" xmlns:v="urn:schemas-microsoft-com:vml" xmlns:wp14="http://schemas.microsoft.com/office/word/2010/wordprocessingDrawing" xmlns:wp="http://schemas.openxmlformats.org/drawingml/2006/wordprocessingDrawing" xmlns:w10="urn:schemas-microsoft-com:office:word" xmlns:w="http://schemas.openxmlformats.org/wordprocessingml/2006/main" xmlns:w14="http://schemas.microsoft.com/office/word/2010/wordml" xmlns:w15="http://schemas.microsoft.com/office/word/2012/wordml" xmlns:w16cex="http://schemas.microsoft.com/office/word/2018/wordml/cex" xmlns:w16cid="http://schemas.microsoft.com/office/word/2016/wordml/cid" xmlns:w16="http://schemas.microsoft.com/office/word/2018/wordml" xmlns:w16du="http://schemas.microsoft.com/office/word/2023/wordml/word16du" xmlns:w16sdtdh="http://schemas.microsoft.com/office/word/2020/wordml/sdtdatahash" xmlns:w16sdtfl="http://schemas.microsoft.com/office/word/2024/wordml/sdtformatlock" xmlns:w16se="http://schemas.microsoft.com/office/word/2015/wordml/symex" xmlns:wpg="http://schemas.microsoft.com/office/word/2010/wordprocessingGroup" xmlns:wpi="http://schemas.microsoft.com/office/word/2010/wordprocessingInk" xmlns:wne="http://schemas.microsoft.com/office/word/2006/wordml" xmlns:wps="http://schemas.microsoft.com/office/word/2010/wordprocessingShape" mc:Ignorable="w14 w15 w16se w16cid w16 w16cex w16sdtdh w16sdtfl w16du wp14">
   <w:abstractNum w:abstractNumId="0" w15:restartNumberingAfterBreak="0">
     <w:nsid w:val="01DF6F9E"/>
     <w:multiLevelType w:val="hybridMultilevel"/>
@@ -1085,6 +1266,119 @@
     </w:lvl>
   </w:abstractNum>
   <w:abstractNum w:abstractNumId="6" w15:restartNumberingAfterBreak="0">
+    <w:nsid w:val="482D2EDD"/>
+    <w:multiLevelType w:val="hybridMultilevel"/>
+    <w:tmpl w:val="046C0B84"/>
+    <w:lvl w:ilvl="0" w:tplc="04090001">
+      <w:start w:val="1"/>
+      <w:numFmt w:val="bullet"/>
+      <w:lvlText w:val=""/>
+      <w:lvlJc w:val="left"/>
+      <w:pPr>
+        <w:ind w:left="720" w:hanging="360"/>
+      </w:pPr>
+      <w:rPr>
+        <w:rFonts w:ascii="Symbol" w:hAnsi="Symbol" w:hint="default"/>
+      </w:rPr>
+    </w:lvl>
+    <w:lvl w:ilvl="1" w:tplc="04090003" w:tentative="1">
+      <w:start w:val="1"/>
+      <w:numFmt w:val="bullet"/>
+      <w:lvlText w:val="o"/>
+      <w:lvlJc w:val="left"/>
+      <w:pPr>
+        <w:ind w:left="1440" w:hanging="360"/>
+      </w:pPr>
+      <w:rPr>
+        <w:rFonts w:ascii="Courier New" w:hAnsi="Courier New" w:cs="Courier New" w:hint="default"/>
+      </w:rPr>
+    </w:lvl>
+    <w:lvl w:ilvl="2" w:tplc="04090005" w:tentative="1">
+      <w:start w:val="1"/>
+      <w:numFmt w:val="bullet"/>
+      <w:lvlText w:val=""/>
+      <w:lvlJc w:val="left"/>
+      <w:pPr>
+        <w:ind w:left="2160" w:hanging="360"/>
+      </w:pPr>
+      <w:rPr>
+        <w:rFonts w:ascii="Wingdings" w:hAnsi="Wingdings" w:hint="default"/>
+      </w:rPr>
+    </w:lvl>
+    <w:lvl w:ilvl="3" w:tplc="04090001" w:tentative="1">
+      <w:start w:val="1"/>
+      <w:numFmt w:val="bullet"/>
+      <w:lvlText w:val=""/>
+      <w:lvlJc w:val="left"/>
+      <w:pPr>
+        <w:ind w:left="2880" w:hanging="360"/>
+      </w:pPr>
+      <w:rPr>
+        <w:rFonts w:ascii="Symbol" w:hAnsi="Symbol" w:hint="default"/>
+      </w:rPr>
+    </w:lvl>
+    <w:lvl w:ilvl="4" w:tplc="04090003" w:tentative="1">
+      <w:start w:val="1"/>
+      <w:numFmt w:val="bullet"/>
+      <w:lvlText w:val="o"/>
+      <w:lvlJc w:val="left"/>
+      <w:pPr>
+        <w:ind w:left="3600" w:hanging="360"/>
+      </w:pPr>
+      <w:rPr>
+        <w:rFonts w:ascii="Courier New" w:hAnsi="Courier New" w:cs="Courier New" w:hint="default"/>
+      </w:rPr>
+    </w:lvl>
+    <w:lvl w:ilvl="5" w:tplc="04090005" w:tentative="1">
+      <w:start w:val="1"/>
+      <w:numFmt w:val="bullet"/>
+      <w:lvlText w:val=""/>
+      <w:lvlJc w:val="left"/>
+      <w:pPr>
+        <w:ind w:left="4320" w:hanging="360"/>
+      </w:pPr>
+      <w:rPr>
+        <w:rFonts w:ascii="Wingdings" w:hAnsi="Wingdings" w:hint="default"/>
+      </w:rPr>
+    </w:lvl>
+    <w:lvl w:ilvl="6" w:tplc="04090001" w:tentative="1">
+      <w:start w:val="1"/>
+      <w:numFmt w:val="bullet"/>
+      <w:lvlText w:val=""/>
+      <w:lvlJc w:val="left"/>
+      <w:pPr>
+        <w:ind w:left="5040" w:hanging="360"/>
+      </w:pPr>
+      <w:rPr>
+        <w:rFonts w:ascii="Symbol" w:hAnsi="Symbol" w:hint="default"/>
+      </w:rPr>
+    </w:lvl>
+    <w:lvl w:ilvl="7" w:tplc="04090003" w:tentative="1">
+      <w:start w:val="1"/>
+      <w:numFmt w:val="bullet"/>
+      <w:lvlText w:val="o"/>
+      <w:lvlJc w:val="left"/>
+      <w:pPr>
+        <w:ind w:left="5760" w:hanging="360"/>
+      </w:pPr>
+      <w:rPr>
+        <w:rFonts w:ascii="Courier New" w:hAnsi="Courier New" w:cs="Courier New" w:hint="default"/>
+      </w:rPr>
+    </w:lvl>
+    <w:lvl w:ilvl="8" w:tplc="04090005" w:tentative="1">
+      <w:start w:val="1"/>
+      <w:numFmt w:val="bullet"/>
+      <w:lvlText w:val=""/>
+      <w:lvlJc w:val="left"/>
+      <w:pPr>
+        <w:ind w:left="6480" w:hanging="360"/>
+      </w:pPr>
+      <w:rPr>
+        <w:rFonts w:ascii="Wingdings" w:hAnsi="Wingdings" w:hint="default"/>
+      </w:rPr>
+    </w:lvl>
+  </w:abstractNum>
+  <w:abstractNum w:abstractNumId="7" w15:restartNumberingAfterBreak="0">
     <w:nsid w:val="56AF4C83"/>
     <w:multiLevelType w:val="hybridMultilevel"/>
     <w:tmpl w:val="0356694A"/>
@@ -1197,7 +1491,7 @@
       </w:rPr>
     </w:lvl>
   </w:abstractNum>
-  <w:abstractNum w:abstractNumId="7" w15:restartNumberingAfterBreak="0">
+  <w:abstractNum w:abstractNumId="8" w15:restartNumberingAfterBreak="0">
     <w:nsid w:val="65117D71"/>
     <w:multiLevelType w:val="hybridMultilevel"/>
     <w:tmpl w:val="6CAC6278"/>
@@ -1310,7 +1604,7 @@
       </w:rPr>
     </w:lvl>
   </w:abstractNum>
-  <w:abstractNum w:abstractNumId="8" w15:restartNumberingAfterBreak="0">
+  <w:abstractNum w:abstractNumId="9" w15:restartNumberingAfterBreak="0">
     <w:nsid w:val="697171D0"/>
     <w:multiLevelType w:val="hybridMultilevel"/>
     <w:tmpl w:val="2CA4D424"/>
@@ -1424,7 +1718,7 @@
     </w:lvl>
   </w:abstractNum>
   <w:num w:numId="1" w16cid:durableId="344672316">
-    <w:abstractNumId w:val="6"/>
+    <w:abstractNumId w:val="7"/>
   </w:num>
   <w:num w:numId="2" w16cid:durableId="1945571066">
     <w:abstractNumId w:val="5"/>
@@ -1442,13 +1736,16 @@
     <w:abstractNumId w:val="0"/>
   </w:num>
   <w:num w:numId="7" w16cid:durableId="1029911040">
-    <w:abstractNumId w:val="8"/>
+    <w:abstractNumId w:val="9"/>
   </w:num>
   <w:num w:numId="8" w16cid:durableId="3359869">
     <w:abstractNumId w:val="4"/>
   </w:num>
   <w:num w:numId="9" w16cid:durableId="1903655">
-    <w:abstractNumId w:val="7"/>
+    <w:abstractNumId w:val="8"/>
+  </w:num>
+  <w:num w:numId="10" w16cid:durableId="1143809001">
+    <w:abstractNumId w:val="6"/>
   </w:num>
 </w:numbering>
 </file>

</xml_diff>